<commit_message>
Paper B: apply review-03 minor revisions — abstract/body data consistency (5.15/-31%, N* in [448,480]); refine 'any-ladder certification' (sufficient-not-necessary prescreener + expert composite cert); tau selection as post-processing on psi-rope-rand (--rand-max); Q1 adds 6-band empirical disaster (57.61); coverage gradient marked empirical/mechanism-unknown; conclusion adds performance-provability tradeoff; unitary scope limited (rand not verified)
</commit_message>
<xml_diff>
--- a/papers/论文B中文规范版-PhaseCompleteLadders-v2.1-20260823.docx
+++ b/papers/论文B中文规范版-PhaseCompleteLadders-v2.1-20260823.docx
@@ -564,30 +564,30 @@
         <w:rPr>
           <w:rFonts w:hint="eastAsia"/>
         </w:rPr>
-        <w:t xml:space="preserve">的边带在所有外推长度与所有种子上严格改善性能——</w:t>
-      </w:r>
-      <w:r>
-        <w:rPr>
-          <w:rFonts w:hint="eastAsia"/>
-          <w:b/>
-          <w:bCs/>
-        </w:rPr>
-        <w:t xml:space="preserve">覆盖以梯度而非阈值方式起作用（单一八带→七带剪枝案例，3</w:t>
-      </w:r>
-      <w:r>
-        <w:rPr>
-          <w:b/>
-          <w:bCs/>
-        </w:rPr>
-        <w:t xml:space="preserve"> </w:t>
-      </w:r>
-      <w:r>
-        <w:rPr>
-          <w:rFonts w:hint="eastAsia"/>
-          <w:b/>
-          <w:bCs/>
-        </w:rPr>
-        <w:t xml:space="preserve">个种子；多阶梯扫描为未来工作）</w:t>
+        <w:t xml:space="preserve">的边带在所有外推长度与所有种子上严格改善性能——****经验上</w:t>
+      </w:r>
+      <w:r>
+        <w:rPr>
+          <w:rFonts w:hint="eastAsia"/>
+          <w:b/>
+          <w:bCs/>
+        </w:rPr>
+        <w:t xml:space="preserve">，覆盖以梯度而非阈值方式起作用（单一八带→七带剪枝案例，3</w:t>
+      </w:r>
+      <w:r>
+        <w:rPr>
+          <w:b/>
+          <w:bCs/>
+        </w:rPr>
+        <w:t xml:space="preserve"> </w:t>
+      </w:r>
+      <w:r>
+        <w:rPr>
+          <w:rFonts w:hint="eastAsia"/>
+          <w:b/>
+          <w:bCs/>
+        </w:rPr>
+        <w:t xml:space="preserve">个种子；机制未明，多阶梯扫描为未来工作）</w:t>
       </w:r>
       <w:r>
         <w:rPr>
@@ -1499,7 +1499,44 @@
         <w:rPr>
           <w:rFonts w:hint="eastAsia"/>
         </w:rPr>
-        <w:t xml:space="preserve">：可认证阶梯（C=4）携带机器检查的有理框架证书；七带最优方案携带复合证书；任意阶梯由带健全性证明的反射检查器统一判定。</w:t>
+        <w:t xml:space="preserve">：可认证阶梯（C=4）携带机器检查的有理框架证书；七带最优方案携带特制专家复合证书；</w:t>
+      </w:r>
+      <w:r>
+        <w:rPr>
+          <w:rFonts w:hint="eastAsia"/>
+          <w:b/>
+          <w:bCs/>
+        </w:rPr>
+        <w:t xml:space="preserve">任意阶梯的可判定性认证</w:t>
+      </w:r>
+      <w:r>
+        <w:rPr>
+          <w:rFonts w:hint="eastAsia"/>
+        </w:rPr>
+        <w:t xml:space="preserve">由带机器检查健全性定理的反射检查器提供（</w:t>
+      </w:r>
+      <w:r>
+        <w:rPr>
+          <w:rFonts w:hint="eastAsia"/>
+          <w:b/>
+          <w:bCs/>
+        </w:rPr>
+        <w:t xml:space="preserve">充分非必要</w:t>
+      </w:r>
+      <w:r>
+        <w:rPr>
+          <w:rFonts w:hint="eastAsia"/>
+        </w:rPr>
+        <w:t xml:space="preserve">的预筛器，存在假阴性，如</w:t>
+      </w:r>
+      <w:r>
+        <w:t xml:space="preserve"> E5’’ </w:t>
+      </w:r>
+      <w:r>
+        <w:rPr>
+          <w:rFonts w:hint="eastAsia"/>
+        </w:rPr>
+        <w:t xml:space="preserve">七带需专家证书覆盖）。</w:t>
       </w:r>
     </w:p>
     <w:p>
@@ -2386,7 +2423,16 @@
         <w:rPr>
           <w:rFonts w:hint="eastAsia"/>
         </w:rPr>
-        <w:t xml:space="preserve">的框架界/衰减界/证书经酉不变性自动覆盖旋转版本（</w:t>
+        <w:t xml:space="preserve">的框架界/衰减界/证书经酉不变性自动覆盖旋转版本（对几何阶梯的旋转；psi-rope-rand</w:t>
+      </w:r>
+      <w:r>
+        <w:t xml:space="preserve"> </w:t>
+      </w:r>
+      <w:r>
+        <w:rPr>
+          <w:rFonts w:hint="eastAsia"/>
+        </w:rPr>
+        <w:t xml:space="preserve">的随机阶梯未通过检查器验证，不在证书范围）（</w:t>
       </w:r>
       <w:r>
         <w:rPr>
@@ -4637,7 +4683,57 @@
         <w:rPr>
           <w:rFonts w:hint="eastAsia"/>
         </w:rPr>
-        <w:t xml:space="preserve">：对随机旋转族温和裁剪高频端（剪去约</w:t>
+        <w:t xml:space="preserve">：psi-rope-rand</w:t>
+      </w:r>
+      <w:r>
+        <w:t xml:space="preserve"> </w:t>
+      </w:r>
+      <w:r>
+        <w:rPr>
+          <w:rFonts w:hint="eastAsia"/>
+        </w:rPr>
+        <w:t xml:space="preserve">本身是随机稠密旋转（无内禀频率选择机制），我们以</w:t>
+      </w:r>
+      <w:r>
+        <w:t xml:space="preserve"> </w:t>
+      </w:r>
+      <w:r>
+        <w:rPr>
+          <w:rStyle w:val="VerbatimChar"/>
+        </w:rPr>
+        <w:t xml:space="preserve">--rand-max</w:t>
+      </w:r>
+      <w:r>
+        <w:t xml:space="preserve"> </w:t>
+      </w:r>
+      <w:r>
+        <w:rPr>
+          <w:rFonts w:hint="eastAsia"/>
+        </w:rPr>
+        <w:t xml:space="preserve">裁剪作为</w:t>
+      </w:r>
+      <w:r>
+        <w:rPr>
+          <w:rFonts w:hint="eastAsia"/>
+          <w:b/>
+          <w:bCs/>
+        </w:rPr>
+        <w:t xml:space="preserve">后处理</w:t>
+      </w:r>
+      <w:r>
+        <w:rPr>
+          <w:rFonts w:hint="eastAsia"/>
+        </w:rPr>
+        <w:t xml:space="preserve">实现</w:t>
+      </w:r>
+      <w:r>
+        <w:t xml:space="preserve"> τ </w:t>
+      </w:r>
+      <w:r>
+        <w:rPr>
+          <w:rFonts w:hint="eastAsia"/>
+        </w:rPr>
+        <w:t xml:space="preserve">感知的高频移除——对旋转族温和裁剪高频端（剪去约</w:t>
       </w:r>
       <w:r>
         <w:t xml:space="preserve"> 14–21% </w:t>
@@ -4948,33 +5044,94 @@
       </w:r>
       <w:r>
         <w:rPr>
-          <w:b/>
-          <w:bCs/>
-        </w:rPr>
-        <w:t xml:space="preserve">τ </w:t>
-      </w:r>
-      <w:r>
-        <w:rPr>
-          <w:rFonts w:hint="eastAsia"/>
-          <w:b/>
-          <w:bCs/>
-        </w:rPr>
-        <w:t xml:space="preserve">感知频率选择：保留低中频</w:t>
-      </w:r>
-      <w:r>
-        <w:rPr>
-          <w:b/>
-          <w:bCs/>
-        </w:rPr>
-        <w:t xml:space="preserve"> + </w:t>
-      </w:r>
-      <w:r>
-        <w:rPr>
-          <w:rFonts w:hint="eastAsia"/>
-          <w:b/>
-          <w:bCs/>
-        </w:rPr>
-        <w:t xml:space="preserve">温和裁剪高频端（最优区随训练量右移）</w:t>
+          <w:rFonts w:hint="eastAsia"/>
+          <w:b/>
+          <w:bCs/>
+        </w:rPr>
+        <w:t xml:space="preserve">基于</w:t>
+      </w:r>
+      <w:r>
+        <w:rPr>
+          <w:b/>
+          <w:bCs/>
+        </w:rPr>
+        <w:t xml:space="preserve"> τ </w:t>
+      </w:r>
+      <w:r>
+        <w:rPr>
+          <w:rFonts w:hint="eastAsia"/>
+          <w:b/>
+          <w:bCs/>
+        </w:rPr>
+        <w:t xml:space="preserve">裁剪的</w:t>
+      </w:r>
+      <w:r>
+        <w:rPr>
+          <w:b/>
+          <w:bCs/>
+        </w:rPr>
+        <w:t xml:space="preserve"> </w:t>
+      </w:r>
+      <w:r>
+        <w:rPr>
+          <w:rFonts w:hint="eastAsia"/>
+          <w:b/>
+          <w:bCs/>
+        </w:rPr>
+        <w:t xml:space="preserve">psi-rope-rand：psi-rope-rand</w:t>
+      </w:r>
+      <w:r>
+        <w:rPr>
+          <w:b/>
+          <w:bCs/>
+        </w:rPr>
+        <w:t xml:space="preserve"> </w:t>
+      </w:r>
+      <w:r>
+        <w:rPr>
+          <w:rFonts w:hint="eastAsia"/>
+          <w:b/>
+          <w:bCs/>
+        </w:rPr>
+        <w:t xml:space="preserve">提供稠密覆盖，</w:t>
+      </w:r>
+      <w:r>
+        <w:rPr>
+          <w:rStyle w:val="VerbatimChar"/>
+          <w:b/>
+          <w:bCs/>
+        </w:rPr>
+        <w:t xml:space="preserve">--rand-max</w:t>
+      </w:r>
+      <w:r>
+        <w:rPr>
+          <w:b/>
+          <w:bCs/>
+        </w:rPr>
+        <w:t xml:space="preserve"> </w:t>
+      </w:r>
+      <w:r>
+        <w:rPr>
+          <w:rFonts w:hint="eastAsia"/>
+          <w:b/>
+          <w:bCs/>
+        </w:rPr>
+        <w:t xml:space="preserve">裁剪提供</w:t>
+      </w:r>
+      <w:r>
+        <w:rPr>
+          <w:b/>
+          <w:bCs/>
+        </w:rPr>
+        <w:t xml:space="preserve"> τ </w:t>
+      </w:r>
+      <w:r>
+        <w:rPr>
+          <w:rFonts w:hint="eastAsia"/>
+          <w:b/>
+          <w:bCs/>
+        </w:rPr>
+        <w:t xml:space="preserve">感知的高频移除（最优区随训练量右移）</w:t>
       </w:r>
       <w:r>
         <w:rPr>
@@ -14341,7 +14498,7 @@
           <w:b/>
           <w:bCs/>
         </w:rPr>
-        <w:t xml:space="preserve">端到端复合证书已</w:t>
+        <w:t xml:space="preserve">复合表示稳定性界已</w:t>
       </w:r>
       <w:r>
         <w:rPr>
@@ -14879,7 +15036,19 @@
         <w:t xml:space="preserve">自动覆盖旋转版本</w:t>
       </w:r>
       <w:r>
-        <w:t xml:space="preserve">——</w:t>
+        <w:rPr>
+          <w:rFonts w:hint="eastAsia"/>
+        </w:rPr>
+        <w:t xml:space="preserve">（对通过检查器或特制证书的几何阶梯；psi-rope-rand</w:t>
+      </w:r>
+      <w:r>
+        <w:t xml:space="preserve"> </w:t>
+      </w:r>
+      <w:r>
+        <w:rPr>
+          <w:rFonts w:hint="eastAsia"/>
+        </w:rPr>
+        <w:t xml:space="preserve">的随机阶梯未通过检查器验证，不在证书范围）——</w:t>
       </w:r>
       <w:r>
         <w:rPr>
@@ -20184,6 +20353,137 @@
         </w:rPr>
         <w:t xml:space="preserve">带阶梯内含可认证子核——表达性与可证明性在同一阶梯族内共存互补。证伪假设与保留假设并报——这条律离终态还有距离，但变量已被命名、仪器已就位、边界已被明确标出。</w:t>
       </w:r>
+      <w:r>
+        <w:rPr>
+          <w:rStyle w:val="VerbatimChar"/>
+        </w:rPr>
+        <w:t xml:space="preserve">n</w:t>
+      </w:r>
+      <w:r>
+        <w:t xml:space="preserve">n</w:t>
+      </w:r>
+      <w:r>
+        <w:rPr>
+          <w:rFonts w:hint="eastAsia"/>
+          <w:b/>
+          <w:bCs/>
+        </w:rPr>
+        <w:t xml:space="preserve">性能-可证明性权衡（结论性讨论）</w:t>
+      </w:r>
+      <w:r>
+        <w:rPr>
+          <w:rFonts w:hint="eastAsia"/>
+        </w:rPr>
+        <w:t xml:space="preserve">：本研究在可控规模下表明，为位置编码基函数提供机器可检查的表示稳定性证书，其性能代价是清晰且可测量的——相对于无证书的强基线</w:t>
+      </w:r>
+      <w:r>
+        <w:t xml:space="preserve"> </w:t>
+      </w:r>
+      <w:r>
+        <w:rPr>
+          <w:rFonts w:hint="eastAsia"/>
+        </w:rPr>
+        <w:t xml:space="preserve">ALiBi，带证书方案在</w:t>
+      </w:r>
+      <w:r>
+        <w:t xml:space="preserve"> 8× </w:t>
+      </w:r>
+      <w:r>
+        <w:rPr>
+          <w:rFonts w:hint="eastAsia"/>
+        </w:rPr>
+        <w:t xml:space="preserve">外推的</w:t>
+      </w:r>
+      <w:r>
+        <w:t xml:space="preserve"> PPL </w:t>
+      </w:r>
+      <w:r>
+        <w:rPr>
+          <w:rFonts w:hint="eastAsia"/>
+        </w:rPr>
+        <w:t xml:space="preserve">差距约为</w:t>
+      </w:r>
+      <w:r>
+        <w:t xml:space="preserve"> </w:t>
+      </w:r>
+      <w:r>
+        <w:rPr>
+          <w:rFonts w:hint="eastAsia"/>
+        </w:rPr>
+        <w:t xml:space="preserve">30%（C=4</w:t>
+      </w:r>
+      <w:r>
+        <w:t xml:space="preserve"> 12.75 vs ALiBi </w:t>
+      </w:r>
+      <w:r>
+        <w:rPr>
+          <w:rFonts w:hint="eastAsia"/>
+        </w:rPr>
+        <w:t xml:space="preserve">4.47；复合证书七带</w:t>
+      </w:r>
+      <w:r>
+        <w:t xml:space="preserve"> </w:t>
+      </w:r>
+      <w:r>
+        <w:rPr>
+          <w:rFonts w:hint="eastAsia"/>
+        </w:rPr>
+        <w:t xml:space="preserve">12.40）。在需要审计的合规场景（金融、医疗等高风险的</w:t>
+      </w:r>
+      <w:r>
+        <w:t xml:space="preserve"> AI </w:t>
+      </w:r>
+      <w:r>
+        <w:rPr>
+          <w:rFonts w:hint="eastAsia"/>
+        </w:rPr>
+        <w:t xml:space="preserve">部署）中，这一代价是明确且可接受的：可审计性提供了独立于经验性能的保证，而「性能-可证明性前沿」（§9.1）正是这一权衡的系统化呈现——沿前沿分布：最优性能（ALiBi，无审计）→</w:t>
+      </w:r>
+      <w:r>
+        <w:t xml:space="preserve"> </w:t>
+      </w:r>
+      <w:r>
+        <w:rPr>
+          <w:rFonts w:hint="eastAsia"/>
+        </w:rPr>
+        <w:t xml:space="preserve">旋转族内最优（psi-rope-rand，正交）→</w:t>
+      </w:r>
+      <w:r>
+        <w:t xml:space="preserve"> </w:t>
+      </w:r>
+      <w:r>
+        <w:rPr>
+          <w:rFonts w:hint="eastAsia"/>
+        </w:rPr>
+        <w:t xml:space="preserve">次优性能（复合证书）→</w:t>
+      </w:r>
+      <w:r>
+        <w:t xml:space="preserve"> </w:t>
+      </w:r>
+      <w:r>
+        <w:rPr>
+          <w:rFonts w:hint="eastAsia"/>
+        </w:rPr>
+        <w:t xml:space="preserve">紧证书（强审计）。我们主张，在审计合规语境下，证书的存在优先于</w:t>
+      </w:r>
+      <w:r>
+        <w:t xml:space="preserve"> 1–2 </w:t>
+      </w:r>
+      <w:r>
+        <w:rPr>
+          <w:rFonts w:hint="eastAsia"/>
+        </w:rPr>
+        <w:t xml:space="preserve">个</w:t>
+      </w:r>
+      <w:r>
+        <w:t xml:space="preserve"> PPL </w:t>
+      </w:r>
+      <w:r>
+        <w:rPr>
+          <w:rFonts w:hint="eastAsia"/>
+        </w:rPr>
+        <w:t xml:space="preserve">点。</w:t>
+      </w:r>
     </w:p>
     <w:bookmarkEnd w:id="37"/>
     <w:bookmarkStart w:id="38" w:name="参考文献"/>
@@ -21602,7 +21902,84 @@
         <w:rPr>
           <w:rFonts w:hint="eastAsia"/>
         </w:rPr>
-        <w:t xml:space="preserve">带训练点。另：复合证书的装配机制本身是阶梯无关的——对任意给定阶梯，只需构造其对相干加权上界即可套用同一骨架（见</w:t>
+        <w:t xml:space="preserve">带训练点；根据</w:t>
+      </w:r>
+      <w:r>
+        <w:t xml:space="preserve"> §8.4 </w:t>
+      </w:r>
+      <w:r>
+        <w:rPr>
+          <w:rFonts w:hint="eastAsia"/>
+        </w:rPr>
+        <w:t xml:space="preserve">的</w:t>
+      </w:r>
+      <w:r>
+        <w:t xml:space="preserve"> τ </w:t>
+      </w:r>
+      <w:r>
+        <w:rPr>
+          <w:rFonts w:hint="eastAsia"/>
+        </w:rPr>
+        <w:t xml:space="preserve">三剪实验，剪掉</w:t>
+      </w:r>
+      <w:r>
+        <w:t xml:space="preserve"> 127 </w:t>
+      </w:r>
+      <w:r>
+        <w:rPr>
+          <w:rFonts w:hint="eastAsia"/>
+        </w:rPr>
+        <w:t xml:space="preserve">带后的</w:t>
+      </w:r>
+      <w:r>
+        <w:t xml:space="preserve"> 6 </w:t>
+      </w:r>
+      <w:r>
+        <w:rPr>
+          <w:rFonts w:hint="eastAsia"/>
+        </w:rPr>
+        <w:t xml:space="preserve">带版本其</w:t>
+      </w:r>
+      <w:r>
+        <w:t xml:space="preserve"> 8× </w:t>
+      </w:r>
+      <w:r>
+        <w:rPr>
+          <w:rFonts w:hint="eastAsia"/>
+        </w:rPr>
+        <w:t xml:space="preserve">外推</w:t>
+      </w:r>
+      <w:r>
+        <w:t xml:space="preserve"> PPL </w:t>
+      </w:r>
+      <w:r>
+        <w:rPr>
+          <w:rFonts w:hint="eastAsia"/>
+        </w:rPr>
+        <w:t xml:space="preserve">为灾难性的</w:t>
+      </w:r>
+      <w:r>
+        <w:t xml:space="preserve"> </w:t>
+      </w:r>
+      <w:r>
+        <w:rPr>
+          <w:rFonts w:hint="eastAsia"/>
+        </w:rPr>
+        <w:t xml:space="preserve">57.61，远差于七带版本（12.40）——</w:t>
+      </w:r>
+      <w:r>
+        <w:rPr>
+          <w:rFonts w:hint="eastAsia"/>
+          <w:b/>
+          <w:bCs/>
+        </w:rPr>
+        <w:t xml:space="preserve">因此该版本无论从形式化角度还是实证角度均不被支持</w:t>
+      </w:r>
+      <w:r>
+        <w:rPr>
+          <w:rFonts w:hint="eastAsia"/>
+        </w:rPr>
+        <w:t xml:space="preserve">。另：复合证书的装配机制本身是阶梯无关的——对任意给定阶梯，只需构造其对相干加权上界即可套用同一骨架（见</w:t>
       </w:r>
       <w:r>
         <w:t xml:space="preserve"> Q3 </w:t>

</xml_diff>

<commit_message>
Paper B: review-03 accept final micro-fixes — clean redundant asterisks in abstract coverage clause; promote tradeoff discussion to standard heading (### 性能-可证明性权衡) with real newline
</commit_message>
<xml_diff>
--- a/papers/论文B中文规范版-PhaseCompleteLadders-v2.1-20260823.docx
+++ b/papers/论文B中文规范版-PhaseCompleteLadders-v2.1-20260823.docx
@@ -2,7 +2,7 @@
 <file path=word/document.xml><?xml version="1.0" encoding="utf-8"?>
 <w:document xmlns:w="http://schemas.openxmlformats.org/wordprocessingml/2006/main" xmlns:m="http://schemas.openxmlformats.org/officeDocument/2006/math" xmlns:r="http://schemas.openxmlformats.org/officeDocument/2006/relationships" xmlns:o="urn:schemas-microsoft-com:office:office" xmlns:v="urn:schemas-microsoft-com:vml" xmlns:w10="urn:schemas-microsoft-com:office:word" xmlns:a="http://schemas.openxmlformats.org/drawingml/2006/main" xmlns:pic="http://schemas.openxmlformats.org/drawingml/2006/picture" xmlns:wp="http://schemas.openxmlformats.org/drawingml/2006/wordprocessingDrawing">
   <w:body>
-    <w:bookmarkStart w:id="42" w:name="相位截断频率阶梯外推实证与可认证的基表示稳定性核"/>
+    <w:bookmarkStart w:id="43" w:name="相位截断频率阶梯外推实证与可认证的基表示稳定性核"/>
     <w:p>
       <w:pPr>
         <w:pStyle w:val="Heading1"/>
@@ -564,86 +564,120 @@
         <w:rPr>
           <w:rFonts w:hint="eastAsia"/>
         </w:rPr>
-        <w:t xml:space="preserve">的边带在所有外推长度与所有种子上严格改善性能——****经验上</w:t>
-      </w:r>
-      <w:r>
-        <w:rPr>
-          <w:rFonts w:hint="eastAsia"/>
-          <w:b/>
-          <w:bCs/>
+        <w:t xml:space="preserve">的边带在所有外推长度与所有种子上严格改善性能——</w:t>
+      </w:r>
+      <w:r>
+        <w:rPr>
+          <w:rFonts w:hint="eastAsia"/>
+          <w:b/>
+          <w:bCs/>
+        </w:rPr>
+        <w:t xml:space="preserve">经验上</w:t>
+      </w:r>
+      <w:r>
+        <w:rPr>
+          <w:rFonts w:hint="eastAsia"/>
         </w:rPr>
         <w:t xml:space="preserve">，覆盖以梯度而非阈值方式起作用（单一八带→七带剪枝案例，3</w:t>
       </w:r>
       <w:r>
-        <w:rPr>
-          <w:b/>
-          <w:bCs/>
-        </w:rPr>
-        <w:t xml:space="preserve"> </w:t>
-      </w:r>
-      <w:r>
-        <w:rPr>
-          <w:rFonts w:hint="eastAsia"/>
-          <w:b/>
-          <w:bCs/>
+        <w:t xml:space="preserve"> </w:t>
+      </w:r>
+      <w:r>
+        <w:rPr>
+          <w:rFonts w:hint="eastAsia"/>
         </w:rPr>
         <w:t xml:space="preserve">个种子；机制未明，多阶梯扫描为未来工作）</w:t>
       </w:r>
       <w:r>
         <w:rPr>
           <w:rFonts w:hint="eastAsia"/>
+          <w:b/>
+          <w:bCs/>
         </w:rPr>
         <w:t xml:space="preserve">；（4）可认证的四带阶梯</w:t>
       </w:r>
       <w:r>
+        <w:rPr>
+          <w:b/>
+          <w:bCs/>
+        </w:rPr>
         <w:t xml:space="preserve"> [3,13,53,213] </w:t>
       </w:r>
       <w:r>
         <w:rPr>
           <w:rFonts w:hint="eastAsia"/>
+          <w:b/>
+          <w:bCs/>
         </w:rPr>
         <w:t xml:space="preserve">携带机器检查的有理框架证书（μ=4/5，Coq</w:t>
       </w:r>
       <w:r>
-        <w:t xml:space="preserve"> </w:t>
-      </w:r>
-      <w:r>
-        <w:rPr>
-          <w:rFonts w:hint="eastAsia"/>
+        <w:rPr>
+          <w:b/>
+          <w:bCs/>
+        </w:rPr>
+        <w:t xml:space="preserve"> </w:t>
+      </w:r>
+      <w:r>
+        <w:rPr>
+          <w:rFonts w:hint="eastAsia"/>
+          <w:b/>
+          <w:bCs/>
         </w:rPr>
         <w:t xml:space="preserve">证明），七带几何阶梯内含可认证子核——复合证书（框架核</w:t>
       </w:r>
       <w:r>
+        <w:rPr>
+          <w:b/>
+          <w:bCs/>
+        </w:rPr>
         <w:t xml:space="preserve"> + </w:t>
       </w:r>
       <w:r>
         <w:rPr>
           <w:rFonts w:hint="eastAsia"/>
+          <w:b/>
+          <w:bCs/>
         </w:rPr>
         <w:t xml:space="preserve">能量预算边际）已在</w:t>
       </w:r>
       <w:r>
+        <w:rPr>
+          <w:b/>
+          <w:bCs/>
+        </w:rPr>
         <w:t xml:space="preserve"> Coq </w:t>
       </w:r>
       <w:r>
         <w:rPr>
           <w:rFonts w:hint="eastAsia"/>
+          <w:b/>
+          <w:bCs/>
         </w:rPr>
         <w:t xml:space="preserve">中完成顶层组装（</w:t>
       </w:r>
       <w:r>
         <w:rPr>
           <w:rStyle w:val="VerbatimChar"/>
+          <w:b/>
+          <w:bCs/>
         </w:rPr>
         <w:t xml:space="preserve">champion_e5_composite_certificate</w:t>
       </w:r>
       <w:r>
         <w:rPr>
           <w:rFonts w:hint="eastAsia"/>
+          <w:b/>
+          <w:bCs/>
         </w:rPr>
         <w:t xml:space="preserve">，Qed，证明</w:t>
       </w:r>
       <w:r>
+        <w:rPr>
+          <w:b/>
+          <w:bCs/>
+        </w:rPr>
         <w:t xml:space="preserve"> </w:t>
       </w:r>
       <m:oMath>
@@ -789,347 +823,403 @@
       <w:r>
         <w:rPr>
           <w:rFonts w:hint="eastAsia"/>
+          <w:b/>
+          <w:bCs/>
         </w:rPr>
         <w:t xml:space="preserve">）；任意阶梯的认证由带机器检查健全性定理的反射检查器完成（165</w:t>
       </w:r>
       <w:r>
-        <w:t xml:space="preserve"> </w:t>
-      </w:r>
-      <w:r>
-        <w:rPr>
-          <w:rFonts w:hint="eastAsia"/>
+        <w:rPr>
+          <w:b/>
+          <w:bCs/>
+        </w:rPr>
+        <w:t xml:space="preserve"> </w:t>
+      </w:r>
+      <w:r>
+        <w:rPr>
+          <w:rFonts w:hint="eastAsia"/>
+          <w:b/>
+          <w:bCs/>
         </w:rPr>
         <w:t xml:space="preserve">项</w:t>
       </w:r>
       <w:r>
+        <w:rPr>
+          <w:b/>
+          <w:bCs/>
+        </w:rPr>
         <w:t xml:space="preserve"> Print Assumptions </w:t>
       </w:r>
       <w:r>
         <w:rPr>
           <w:rFonts w:hint="eastAsia"/>
+          <w:b/>
+          <w:bCs/>
         </w:rPr>
         <w:t xml:space="preserve">审计，全部零经典排中）；（5）对照组结果：NTK-aware</w:t>
       </w:r>
       <w:r>
-        <w:t xml:space="preserve"> </w:t>
-      </w:r>
-      <w:r>
-        <w:rPr>
-          <w:rFonts w:hint="eastAsia"/>
+        <w:rPr>
+          <w:b/>
+          <w:bCs/>
+        </w:rPr>
+        <w:t xml:space="preserve"> </w:t>
+      </w:r>
+      <w:r>
+        <w:rPr>
+          <w:rFonts w:hint="eastAsia"/>
+          <w:b/>
+          <w:bCs/>
         </w:rPr>
         <w:t xml:space="preserve">重缩放在</w:t>
       </w:r>
       <w:r>
+        <w:rPr>
+          <w:b/>
+          <w:bCs/>
+        </w:rPr>
         <w:t xml:space="preserve"> 4–8 </w:t>
       </w:r>
       <w:r>
         <w:rPr>
           <w:rFonts w:hint="eastAsia"/>
+          <w:b/>
+          <w:bCs/>
         </w:rPr>
         <w:t xml:space="preserve">倍外推超过相位截断旋转（单个种子</w:t>
       </w:r>
       <w:r>
+        <w:rPr>
+          <w:b/>
+          <w:bCs/>
+        </w:rPr>
         <w:t xml:space="preserve"> 10.74 </w:t>
       </w:r>
       <w:r>
         <w:rPr>
           <w:rFonts w:hint="eastAsia"/>
+          <w:b/>
+          <w:bCs/>
         </w:rPr>
         <w:t xml:space="preserve">对</w:t>
       </w:r>
       <w:r>
+        <w:rPr>
+          <w:b/>
+          <w:bCs/>
+        </w:rPr>
         <w:t xml:space="preserve"> 3 </w:t>
       </w:r>
       <w:r>
         <w:rPr>
           <w:rFonts w:hint="eastAsia"/>
+          <w:b/>
+          <w:bCs/>
         </w:rPr>
         <w:t xml:space="preserve">个种子均值</w:t>
       </w:r>
       <w:r>
-        <w:t xml:space="preserve"> </w:t>
-      </w:r>
-      <w:r>
-        <w:rPr>
-          <w:rFonts w:hint="eastAsia"/>
+        <w:rPr>
+          <w:b/>
+          <w:bCs/>
+        </w:rPr>
+        <w:t xml:space="preserve"> </w:t>
+      </w:r>
+      <w:r>
+        <w:rPr>
+          <w:rFonts w:hint="eastAsia"/>
+          <w:b/>
+          <w:bCs/>
         </w:rPr>
         <w:t xml:space="preserve">12.40）——我们保留的主张是</w:t>
       </w:r>
       <w:r>
         <w:rPr>
           <w:rFonts w:hint="eastAsia"/>
-          <w:b/>
-          <w:bCs/>
         </w:rPr>
         <w:t xml:space="preserve">免测试时修改、免逐长度重调参、且带机器证书</w:t>
       </w:r>
       <w:r>
         <w:rPr>
           <w:rFonts w:hint="eastAsia"/>
+          <w:b/>
+          <w:bCs/>
         </w:rPr>
         <w:t xml:space="preserve">，而非绝对外推性能最优；无位置编码（NoPE）显示灾难性的分布内损失（9.06）却是最平坦的退化曲线（1.27</w:t>
       </w:r>
       <w:r>
-        <w:t xml:space="preserve"> </w:t>
-      </w:r>
-      <w:r>
-        <w:rPr>
-          <w:rFonts w:hint="eastAsia"/>
+        <w:rPr>
+          <w:b/>
+          <w:bCs/>
+        </w:rPr>
+        <w:t xml:space="preserve"> </w:t>
+      </w:r>
+      <w:r>
+        <w:rPr>
+          <w:rFonts w:hint="eastAsia"/>
+          <w:b/>
+          <w:bCs/>
         </w:rPr>
         <w:t xml:space="preserve">倍）——但</w:t>
       </w:r>
       <w:r>
         <w:rPr>
           <w:rFonts w:hint="eastAsia"/>
-          <w:b/>
-          <w:bCs/>
         </w:rPr>
         <w:t xml:space="preserve">位置编码的本质交易是”周期参数化”的属性，而非位置信息的属性</w:t>
       </w:r>
       <w:r>
         <w:rPr>
           <w:rFonts w:hint="eastAsia"/>
+          <w:b/>
+          <w:bCs/>
         </w:rPr>
         <w:t xml:space="preserve">：ALiBi</w:t>
       </w:r>
       <w:r>
-        <w:t xml:space="preserve"> </w:t>
-      </w:r>
-      <w:r>
-        <w:rPr>
-          <w:rFonts w:hint="eastAsia"/>
+        <w:rPr>
+          <w:b/>
+          <w:bCs/>
+        </w:rPr>
+        <w:t xml:space="preserve"> </w:t>
+      </w:r>
+      <w:r>
+        <w:rPr>
+          <w:rFonts w:hint="eastAsia"/>
+          <w:b/>
+          <w:bCs/>
         </w:rPr>
         <w:t xml:space="preserve">分布内仅比最优差</w:t>
       </w:r>
       <w:r>
-        <w:t xml:space="preserve"> </w:t>
-      </w:r>
-      <w:r>
-        <w:rPr>
-          <w:rFonts w:hint="eastAsia"/>
+        <w:rPr>
+          <w:b/>
+          <w:bCs/>
+        </w:rPr>
+        <w:t xml:space="preserve"> </w:t>
+      </w:r>
+      <w:r>
+        <w:rPr>
+          <w:rFonts w:hint="eastAsia"/>
+          <w:b/>
+          <w:bCs/>
         </w:rPr>
         <w:t xml:space="preserve">0.16（4.64</w:t>
       </w:r>
       <w:r>
+        <w:rPr>
+          <w:b/>
+          <w:bCs/>
+        </w:rPr>
         <w:t xml:space="preserve"> vs </w:t>
       </w:r>
       <w:r>
         <w:rPr>
           <w:rFonts w:hint="eastAsia"/>
+          <w:b/>
+          <w:bCs/>
         </w:rPr>
         <w:t xml:space="preserve">4.48）、外推却平坦（退化比</w:t>
       </w:r>
       <w:r>
-        <w:t xml:space="preserve"> </w:t>
-      </w:r>
-      <w:r>
-        <w:rPr>
-          <w:rFonts w:hint="eastAsia"/>
+        <w:rPr>
+          <w:b/>
+          <w:bCs/>
+        </w:rPr>
+        <w:t xml:space="preserve"> </w:t>
+      </w:r>
+      <w:r>
+        <w:rPr>
+          <w:rFonts w:hint="eastAsia"/>
+          <w:b/>
+          <w:bCs/>
         </w:rPr>
         <w:t xml:space="preserve">0.96&lt;1，唯一下降者），非周期偏置以近零代价逃逸该交易。（6）</w:t>
       </w:r>
       <w:r>
         <w:rPr>
           <w:rFonts w:hint="eastAsia"/>
-          <w:b/>
-          <w:bCs/>
         </w:rPr>
         <w:t xml:space="preserve">正式配置复现与</w:t>
       </w:r>
       <w:r>
-        <w:rPr>
-          <w:b/>
-          <w:bCs/>
-        </w:rPr>
         <w:t xml:space="preserve"> τ </w:t>
       </w:r>
       <w:r>
         <w:rPr>
           <w:rFonts w:hint="eastAsia"/>
-          <w:b/>
-          <w:bCs/>
         </w:rPr>
         <w:t xml:space="preserve">感知频率选择（tinystories200</w:t>
       </w:r>
       <w:r>
-        <w:rPr>
-          <w:b/>
-          <w:bCs/>
-        </w:rPr>
         <w:t xml:space="preserve"> · 27000 iters ≈ 9.5 </w:t>
       </w:r>
       <w:r>
         <w:rPr>
           <w:rFonts w:hint="eastAsia"/>
-          <w:b/>
-          <w:bCs/>
         </w:rPr>
         <w:t xml:space="preserve">epoch，云端</w:t>
       </w:r>
       <w:r>
-        <w:rPr>
-          <w:b/>
-          <w:bCs/>
-        </w:rPr>
         <w:t xml:space="preserve"> T4 </w:t>
       </w:r>
       <w:r>
         <w:rPr>
           <w:rFonts w:hint="eastAsia"/>
-          <w:b/>
-          <w:bCs/>
         </w:rPr>
         <w:t xml:space="preserve">与本地逐位对齐）</w:t>
       </w:r>
       <w:r>
         <w:rPr>
           <w:rFonts w:hint="eastAsia"/>
+          <w:b/>
+          <w:bCs/>
         </w:rPr>
         <w:t xml:space="preserve">：四模式对照确认排序（ALiBi</w:t>
       </w:r>
       <w:r>
+        <w:rPr>
+          <w:b/>
+          <w:bCs/>
+        </w:rPr>
         <w:t xml:space="preserve"> 2.11 / t5rel 2.75 / psi-rope-rand 7.50 / e5pp 14.21</w:t>
       </w:r>
       <w:r>
-        <w:t xml:space="preserve"> </w:t>
-      </w:r>
-      <w:r>
+        <w:rPr>
+          <w:b/>
+          <w:bCs/>
+        </w:rPr>
+        <w:t xml:space="preserve"> </w:t>
+      </w:r>
+      <w:r>
+        <w:rPr>
+          <w:b/>
+          <w:bCs/>
+        </w:rPr>
         <w:t xml:space="preserve">@8</w:t>
       </w:r>
       <w:r>
         <w:rPr>
           <w:rFonts w:hint="eastAsia"/>
+          <w:b/>
+          <w:bCs/>
         </w:rPr>
         <w:t xml:space="preserve">×）；</w:t>
       </w:r>
       <w:r>
         <w:rPr>
           <w:rFonts w:hint="eastAsia"/>
-          <w:b/>
-          <w:bCs/>
         </w:rPr>
         <w:t xml:space="preserve">对随机旋转族温和裁剪高频端（截断点</w:t>
       </w:r>
       <w:r>
-        <w:rPr>
-          <w:b/>
-          <w:bCs/>
-        </w:rPr>
-        <w:t xml:space="preserve"> </w:t>
-      </w:r>
-      <w:r>
-        <w:rPr>
-          <w:rFonts w:hint="eastAsia"/>
-          <w:b/>
-          <w:bCs/>
+        <w:t xml:space="preserve"> </w:t>
+      </w:r>
+      <w:r>
+        <w:rPr>
+          <w:rFonts w:hint="eastAsia"/>
         </w:rPr>
         <w:t xml:space="preserve">n&gt;384）将外推从</w:t>
       </w:r>
       <w:r>
-        <w:rPr>
-          <w:b/>
-          <w:bCs/>
-        </w:rPr>
         <w:t xml:space="preserve"> 7.50 </w:t>
       </w:r>
       <w:r>
         <w:rPr>
           <w:rFonts w:hint="eastAsia"/>
-          <w:b/>
-          <w:bCs/>
         </w:rPr>
         <w:t xml:space="preserve">改善至</w:t>
       </w:r>
       <w:r>
-        <w:rPr>
-          <w:b/>
-          <w:bCs/>
-        </w:rPr>
-        <w:t xml:space="preserve"> </w:t>
-      </w:r>
-      <w:r>
-        <w:rPr>
-          <w:rFonts w:hint="eastAsia"/>
-          <w:b/>
-          <w:bCs/>
+        <w:t xml:space="preserve"> </w:t>
+      </w:r>
+      <w:r>
+        <w:rPr>
+          <w:rFonts w:hint="eastAsia"/>
         </w:rPr>
         <w:t xml:space="preserve">5.36（−28%）</w:t>
       </w:r>
       <w:r>
         <w:rPr>
           <w:rFonts w:hint="eastAsia"/>
+          <w:b/>
+          <w:bCs/>
         </w:rPr>
         <w:t xml:space="preserve">——高频随机相位在深训练下过拟合训练窗相位结构，τ</w:t>
       </w:r>
       <w:r>
-        <w:t xml:space="preserve"> </w:t>
-      </w:r>
-      <w:r>
-        <w:rPr>
-          <w:rFonts w:hint="eastAsia"/>
+        <w:rPr>
+          <w:b/>
+          <w:bCs/>
+        </w:rPr>
+        <w:t xml:space="preserve"> </w:t>
+      </w:r>
+      <w:r>
+        <w:rPr>
+          <w:rFonts w:hint="eastAsia"/>
+          <w:b/>
+          <w:bCs/>
         </w:rPr>
         <w:t xml:space="preserve">感知频率选择兑现；而过度裁剪（n&gt;256，8.44）与结构化频率路线（ogrid，19.30）均被否定，</w:t>
       </w:r>
       <w:r>
         <w:rPr>
           <w:rFonts w:hint="eastAsia"/>
-          <w:b/>
-          <w:bCs/>
         </w:rPr>
         <w:t xml:space="preserve">稠密覆盖（相位完备性）仍是外推性能关键</w:t>
       </w:r>
       <w:r>
         <w:rPr>
           <w:rFonts w:hint="eastAsia"/>
+          <w:b/>
+          <w:bCs/>
         </w:rPr>
         <w:t xml:space="preserve">；τ/碰撞机制累计</w:t>
       </w:r>
       <w:r>
-        <w:t xml:space="preserve"> </w:t>
-      </w:r>
-      <w:r>
-        <w:rPr>
-          <w:b/>
-          <w:bCs/>
-        </w:rPr>
+        <w:rPr>
+          <w:b/>
+          <w:bCs/>
+        </w:rPr>
+        <w:t xml:space="preserve"> </w:t>
+      </w:r>
+      <w:r>
         <w:t xml:space="preserve">7 </w:t>
       </w:r>
       <w:r>
         <w:rPr>
           <w:rFonts w:hint="eastAsia"/>
-          <w:b/>
-          <w:bCs/>
         </w:rPr>
         <w:t xml:space="preserve">个正向判决</w:t>
       </w:r>
       <w:r>
         <w:rPr>
           <w:rFonts w:hint="eastAsia"/>
+          <w:b/>
+          <w:bCs/>
         </w:rPr>
         <w:t xml:space="preserve">。我们如实记录被证伪的假设（包括被反例杀死的</w:t>
       </w:r>
       <w:r>
+        <w:rPr>
+          <w:b/>
+          <w:bCs/>
+        </w:rPr>
         <w:t xml:space="preserve"> double-coverage </w:t>
       </w:r>
       <w:r>
         <w:rPr>
           <w:rFonts w:hint="eastAsia"/>
+          <w:b/>
+          <w:bCs/>
         </w:rPr>
         <w:t xml:space="preserve">律与均匀填充假设），并提议将阶梯的</w:t>
       </w:r>
       <w:r>
         <w:rPr>
           <w:rFonts w:hint="eastAsia"/>
-          <w:b/>
-          <w:bCs/>
-        </w:rPr>
-        <w:t xml:space="preserve">相位剖面</w:t>
-      </w:r>
-      <w:r>
-        <w:rPr>
-          <w:rFonts w:hint="eastAsia"/>
-        </w:rPr>
-        <w:t xml:space="preserve">作为任意位置编码的诊断量。</w:t>
+        </w:rPr>
+        <w:t xml:space="preserve">相位剖面**作为任意位置编码的诊断量。</w:t>
       </w:r>
     </w:p>
     <w:p>
@@ -19750,7 +19840,7 @@
     </w:p>
     <w:bookmarkEnd w:id="35"/>
     <w:bookmarkEnd w:id="36"/>
-    <w:bookmarkStart w:id="37" w:name="结论"/>
+    <w:bookmarkStart w:id="38" w:name="结论"/>
     <w:p>
       <w:pPr>
         <w:pStyle w:val="Heading2"/>
@@ -20353,28 +20443,28 @@
         </w:rPr>
         <w:t xml:space="preserve">带阶梯内含可认证子核——表达性与可证明性在同一阶梯族内共存互补。证伪假设与保留假设并报——这条律离终态还有距离，但变量已被命名、仪器已就位、边界已被明确标出。</w:t>
       </w:r>
-      <w:r>
-        <w:rPr>
-          <w:rStyle w:val="VerbatimChar"/>
-        </w:rPr>
-        <w:t xml:space="preserve">n</w:t>
-      </w:r>
-      <w:r>
-        <w:t xml:space="preserve">n</w:t>
-      </w:r>
-      <w:r>
-        <w:rPr>
-          <w:rFonts w:hint="eastAsia"/>
-          <w:b/>
-          <w:bCs/>
+    </w:p>
+    <w:bookmarkStart w:id="37" w:name="性能-可证明性权衡结论性讨论"/>
+    <w:p>
+      <w:pPr>
+        <w:pStyle w:val="Heading3"/>
+      </w:pPr>
+      <w:r>
+        <w:rPr>
+          <w:rFonts w:hint="eastAsia"/>
         </w:rPr>
         <w:t xml:space="preserve">性能-可证明性权衡（结论性讨论）</w:t>
       </w:r>
-      <w:r>
-        <w:rPr>
-          <w:rFonts w:hint="eastAsia"/>
-        </w:rPr>
-        <w:t xml:space="preserve">：本研究在可控规模下表明，为位置编码基函数提供机器可检查的表示稳定性证书，其性能代价是清晰且可测量的——相对于无证书的强基线</w:t>
+    </w:p>
+    <w:p>
+      <w:pPr>
+        <w:pStyle w:val="FirstParagraph"/>
+      </w:pPr>
+      <w:r>
+        <w:rPr>
+          <w:rFonts w:hint="eastAsia"/>
+        </w:rPr>
+        <w:t xml:space="preserve">本研究在可控规模下表明，为位置编码基函数提供机器可检查的表示稳定性证书，其性能代价是清晰且可测量的——相对于无证书的强基线</w:t>
       </w:r>
       <w:r>
         <w:t xml:space="preserve"> </w:t>
@@ -20486,7 +20576,8 @@
       </w:r>
     </w:p>
     <w:bookmarkEnd w:id="37"/>
-    <w:bookmarkStart w:id="38" w:name="参考文献"/>
+    <w:bookmarkEnd w:id="38"/>
+    <w:bookmarkStart w:id="39" w:name="参考文献"/>
     <w:p>
       <w:pPr>
         <w:pStyle w:val="Heading2"/>
@@ -20810,8 +20901,8 @@
         <w:t xml:space="preserve">文献数据库核查校准（核查报告：《参考文献真实性核查报告》）。</w:t>
       </w:r>
     </w:p>
-    <w:bookmarkEnd w:id="38"/>
-    <w:bookmarkStart w:id="39" w:name="附录-a-温控协议"/>
+    <w:bookmarkEnd w:id="39"/>
+    <w:bookmarkStart w:id="40" w:name="附录-a-温控协议"/>
     <w:p>
       <w:pPr>
         <w:pStyle w:val="Heading2"/>
@@ -21050,8 +21141,8 @@
         <w:t xml:space="preserve">立即杀进程。</w:t>
       </w:r>
     </w:p>
-    <w:bookmarkEnd w:id="39"/>
-    <w:bookmarkStart w:id="40" w:name="附录-b-复现清单"/>
+    <w:bookmarkEnd w:id="40"/>
+    <w:bookmarkStart w:id="41" w:name="附录-b-复现清单"/>
     <w:p>
       <w:pPr>
         <w:pStyle w:val="Heading2"/>
@@ -21621,8 +21712,8 @@
         <w:t xml:space="preserve">FFI）。</w:t>
       </w:r>
     </w:p>
-    <w:bookmarkEnd w:id="40"/>
-    <w:bookmarkStart w:id="41" w:name="附录-c-常见问题与边界澄清"/>
+    <w:bookmarkEnd w:id="41"/>
+    <w:bookmarkStart w:id="42" w:name="附录-c-常见问题与边界澄清"/>
     <w:p>
       <w:pPr>
         <w:pStyle w:val="Heading2"/>
@@ -22938,8 +23029,8 @@
         <w:t xml:space="preserve">经验规律声明）。</w:t>
       </w:r>
     </w:p>
-    <w:bookmarkEnd w:id="41"/>
     <w:bookmarkEnd w:id="42"/>
+    <w:bookmarkEnd w:id="43"/>
     <w:sectPr>
       <w:footnotePr>
         <w:numRestart w:val="eachSect"/>

</xml_diff>